<commit_message>
Deploying to gh-pages from @ Morrison-Lab/sds@6bdfd6b111a1072c0e3cf701f53f62916f8c5d9e 🚀
</commit_message>
<xml_diff>
--- a/logistic-inference-handout.docx
+++ b/logistic-inference-handout.docx
@@ -15,7 +15,7 @@
         <w:pStyle w:val="Date"/>
       </w:pPr>
       <w:r>
-        <w:t xml:space="preserve">Last modified: 2026-10-15 18:55:10 (PDT)</w:t>
+        <w:t xml:space="preserve">Last modified: 2026-10-16 00:14:28 (PDT)</w:t>
       </w:r>
     </w:p>
     <w:bookmarkStart w:id="13" w:name="introduction"/>
@@ -4596,7 +4596,7 @@
     </w:p>
     <w:bookmarkEnd w:id="30"/>
     <w:bookmarkEnd w:id="31"/>
-    <w:bookmarkStart w:id="54" w:name="X6921c8acb91e896e6cca408a54c848bac546047"/>
+    <w:bookmarkStart w:id="53" w:name="X6921c8acb91e896e6cca408a54c848bac546047"/>
     <w:p>
       <w:pPr>
         <w:pStyle w:val="Heading2"/>
@@ -5195,31 +5195,11 @@
             <w:r>
               <w:t xml:space="preserve">introduces both terms: observations that share a combination of factor levels and the same values of any continuous predictors have the same covariate pattern, and are called replicates.</w:t>
             </w:r>
-            <w:r>
-              <w:t xml:space="preserve"> </w:t>
-            </w:r>
-            <w:r>
-              <w:t xml:space="preserve">This section follows the treatment in</w:t>
-            </w:r>
-            <w:r>
-              <w:t xml:space="preserve"> </w:t>
-            </w:r>
-            <w:hyperlink r:id="rId36">
-              <w:r>
-                <w:rPr>
-                  <w:rStyle w:val="Hyperlink"/>
-                </w:rPr>
-                <w:t xml:space="preserve">rme</w:t>
-              </w:r>
-            </w:hyperlink>
-            <w:r>
-              <w:t xml:space="preserve">, adapted to logistic regression.</w:t>
-            </w:r>
           </w:p>
         </w:tc>
       </w:tr>
     </w:tbl>
-    <w:bookmarkStart w:id="37" w:name="def-pattern-events"/>
+    <w:bookmarkStart w:id="36" w:name="def-pattern-events"/>
     <w:p>
       <w:pPr>
         <w:pStyle w:val="BodyText"/>
@@ -5509,8 +5489,8 @@
         <w:t xml:space="preserve">.</w:t>
       </w:r>
     </w:p>
-    <w:bookmarkEnd w:id="37"/>
-    <w:bookmarkStart w:id="38" w:name="exm-covariate-patterns"/>
+    <w:bookmarkEnd w:id="36"/>
+    <w:bookmarkStart w:id="37" w:name="exm-covariate-patterns"/>
     <w:p>
       <w:pPr>
         <w:pStyle w:val="BodyText"/>
@@ -6135,8 +6115,8 @@
         <w:t xml:space="preserve">= 3, and it has 55 of them.</w:t>
       </w:r>
     </w:p>
-    <w:bookmarkEnd w:id="38"/>
-    <w:bookmarkStart w:id="40" w:name="def-saturated-model"/>
+    <w:bookmarkEnd w:id="37"/>
+    <w:bookmarkStart w:id="39" w:name="def-saturated-model"/>
     <w:p>
       <w:pPr>
         <w:pStyle w:val="BodyText"/>
@@ -6216,7 +6196,7 @@
       <w:pPr>
         <w:pStyle w:val="BodyText"/>
       </w:pPr>
-      <w:bookmarkStart w:id="39" w:name="eq-saturated-model"/>
+      <w:bookmarkStart w:id="38" w:name="eq-saturated-model"/>
       <m:oMathPara>
         <m:oMathParaPr>
           <m:jc m:val="center"/>
@@ -6413,7 +6393,7 @@
           </m:r>
         </m:oMath>
       </m:oMathPara>
-      <w:bookmarkEnd w:id="39"/>
+      <w:bookmarkEnd w:id="38"/>
     </w:p>
     <w:p>
       <w:pPr>
@@ -6423,7 +6403,7 @@
         <w:t xml:space="preserve">with the outcomes independent given the predictors.</w:t>
       </w:r>
     </w:p>
-    <w:bookmarkEnd w:id="40"/>
+    <w:bookmarkEnd w:id="39"/>
     <w:tbl>
       <w:tblPr>
         <w:tblStyle w:val="Table"/>
@@ -6464,12 +6444,12 @@
                 <wp:inline>
                   <wp:extent cx="152400" cy="152400"/>
                   <wp:effectExtent b="0" l="0" r="0" t="0"/>
-                  <wp:docPr descr="" title="" id="41" name="Picture"/>
+                  <wp:docPr descr="" title="" id="40" name="Picture"/>
                   <a:graphic>
                     <a:graphicData uri="http://schemas.openxmlformats.org/drawingml/2006/picture">
                       <pic:pic>
                         <pic:nvPicPr>
-                          <pic:cNvPr descr="/opt/quarto/share/formats/docx/note.png" id="42" name="Picture"/>
+                          <pic:cNvPr descr="/opt/quarto/share/formats/docx/note.png" id="41" name="Picture"/>
                           <pic:cNvPicPr>
                             <a:picLocks noChangeArrowheads="1" noChangeAspect="1"/>
                           </pic:cNvPicPr>
@@ -6572,7 +6552,7 @@
         </w:tc>
       </w:tr>
     </w:tbl>
-    <w:bookmarkStart w:id="43" w:name="thm-saturated-mle"/>
+    <w:bookmarkStart w:id="42" w:name="thm-saturated-mle"/>
     <w:p>
       <w:pPr>
         <w:pStyle w:val="BodyText"/>
@@ -6735,7 +6715,7 @@
         </m:oMath>
       </m:oMathPara>
     </w:p>
-    <w:bookmarkEnd w:id="43"/>
+    <w:bookmarkEnd w:id="42"/>
     <w:p>
       <w:pPr>
         <w:pStyle w:val="FirstParagraph"/>
@@ -8003,7 +7983,7 @@
         <w:t xml:space="preserve">.</w:t>
       </w:r>
     </w:p>
-    <w:bookmarkStart w:id="45" w:name="def-saturated-deviance"/>
+    <w:bookmarkStart w:id="44" w:name="def-saturated-deviance"/>
     <w:p>
       <w:pPr>
         <w:pStyle w:val="BodyText"/>
@@ -8141,7 +8121,7 @@
       <w:pPr>
         <w:pStyle w:val="BodyText"/>
       </w:pPr>
-      <w:bookmarkStart w:id="44" w:name="eq-saturated-deviance"/>
+      <w:bookmarkStart w:id="43" w:name="eq-saturated-deviance"/>
       <m:oMathPara>
         <m:oMathParaPr>
           <m:jc m:val="center"/>
@@ -8294,10 +8274,10 @@
           </m:r>
         </m:oMath>
       </m:oMathPara>
-      <w:bookmarkEnd w:id="44"/>
+      <w:bookmarkEnd w:id="43"/>
     </w:p>
-    <w:bookmarkEnd w:id="45"/>
-    <w:bookmarkStart w:id="47" w:name="thm-saturated-deviance"/>
+    <w:bookmarkEnd w:id="44"/>
+    <w:bookmarkStart w:id="46" w:name="thm-saturated-deviance"/>
     <w:p>
       <w:pPr>
         <w:pStyle w:val="FirstParagraph"/>
@@ -8364,7 +8344,7 @@
       <w:pPr>
         <w:pStyle w:val="BodyText"/>
       </w:pPr>
-      <w:bookmarkStart w:id="46" w:name="eq-saturated-deviance-grouped"/>
+      <w:bookmarkStart w:id="45" w:name="eq-saturated-deviance-grouped"/>
       <m:oMathPara>
         <m:oMathParaPr>
           <m:jc m:val="center"/>
@@ -8732,7 +8712,7 @@
           </m:r>
         </m:oMath>
       </m:oMathPara>
-      <w:bookmarkEnd w:id="46"/>
+      <w:bookmarkEnd w:id="45"/>
     </w:p>
     <w:p>
       <w:pPr>
@@ -8829,7 +8809,7 @@
         <w:t xml:space="preserve">in its zero-count part.</w:t>
       </w:r>
     </w:p>
-    <w:bookmarkEnd w:id="47"/>
+    <w:bookmarkEnd w:id="46"/>
     <w:p>
       <w:pPr>
         <w:pStyle w:val="BodyText"/>
@@ -9504,12 +9484,12 @@
                 <wp:inline>
                   <wp:extent cx="152400" cy="152400"/>
                   <wp:effectExtent b="0" l="0" r="0" t="0"/>
-                  <wp:docPr descr="" title="" id="48" name="Picture"/>
+                  <wp:docPr descr="" title="" id="47" name="Picture"/>
                   <a:graphic>
                     <a:graphicData uri="http://schemas.openxmlformats.org/drawingml/2006/picture">
                       <pic:pic>
                         <pic:nvPicPr>
-                          <pic:cNvPr descr="/opt/quarto/share/formats/docx/note.png" id="49" name="Picture"/>
+                          <pic:cNvPr descr="/opt/quarto/share/formats/docx/note.png" id="48" name="Picture"/>
                           <pic:cNvPicPr>
                             <a:picLocks noChangeArrowheads="1" noChangeAspect="1"/>
                           </pic:cNvPicPr>
@@ -9624,7 +9604,7 @@
         </w:tc>
       </w:tr>
     </w:tbl>
-    <w:bookmarkStart w:id="50" w:name="cor-deviance-shift"/>
+    <w:bookmarkStart w:id="49" w:name="cor-deviance-shift"/>
     <w:p>
       <w:pPr>
         <w:pStyle w:val="BodyText"/>
@@ -9767,7 +9747,7 @@
         </m:oMath>
       </m:oMathPara>
     </w:p>
-    <w:bookmarkEnd w:id="50"/>
+    <w:bookmarkEnd w:id="49"/>
     <w:p>
       <w:pPr>
         <w:pStyle w:val="FirstParagraph"/>
@@ -10210,7 +10190,7 @@
         <w:t xml:space="preserve">from both sides gives the claim.</w:t>
       </w:r>
     </w:p>
-    <w:bookmarkStart w:id="51" w:name="rem-deviance-shift"/>
+    <w:bookmarkStart w:id="50" w:name="rem-deviance-shift"/>
     <w:p>
       <w:pPr>
         <w:pStyle w:val="BodyText"/>
@@ -10450,8 +10430,8 @@
         <w:t xml:space="preserve">.</w:t>
       </w:r>
     </w:p>
-    <w:bookmarkEnd w:id="51"/>
-    <w:bookmarkStart w:id="52" w:name="exm-saturated-deviance"/>
+    <w:bookmarkEnd w:id="50"/>
+    <w:bookmarkStart w:id="51" w:name="exm-saturated-deviance"/>
     <w:p>
       <w:pPr>
         <w:pStyle w:val="BodyText"/>
@@ -11476,8 +11456,8 @@
         <w:t xml:space="preserve">on the individual babies.</w:t>
       </w:r>
     </w:p>
-    <w:bookmarkEnd w:id="52"/>
-    <w:bookmarkStart w:id="53" w:name="exm-deviance-shift"/>
+    <w:bookmarkEnd w:id="51"/>
+    <w:bookmarkStart w:id="52" w:name="exm-deviance-shift"/>
     <w:p>
       <w:pPr>
         <w:pStyle w:val="BodyText"/>
@@ -12205,9 +12185,9 @@
         <w:t xml:space="preserve">#&gt;            216.818            216.818</w:t>
       </w:r>
     </w:p>
+    <w:bookmarkEnd w:id="52"/>
     <w:bookmarkEnd w:id="53"/>
-    <w:bookmarkEnd w:id="54"/>
-    <w:bookmarkStart w:id="63" w:name="X840099c27253be6d59b8623dccfe2e383b0f72c"/>
+    <w:bookmarkStart w:id="62" w:name="X840099c27253be6d59b8623dccfe2e383b0f72c"/>
     <w:p>
       <w:pPr>
         <w:pStyle w:val="Heading2"/>
@@ -12216,7 +12196,7 @@
         <w:t xml:space="preserve">4 Confidence intervals for the coefficients</w:t>
       </w:r>
     </w:p>
-    <w:bookmarkStart w:id="56" w:name="thm-logistic-mle-distribution"/>
+    <w:bookmarkStart w:id="55" w:name="thm-logistic-mle-distribution"/>
     <w:p>
       <w:pPr>
         <w:pStyle w:val="FirstParagraph"/>
@@ -12395,7 +12375,7 @@
       <w:pPr>
         <w:pStyle w:val="BodyText"/>
       </w:pPr>
-      <w:bookmarkStart w:id="55" w:name="eq-logistic-mle-distribution"/>
+      <w:bookmarkStart w:id="54" w:name="eq-logistic-mle-distribution"/>
       <m:oMathPara>
         <m:oMathParaPr>
           <m:jc m:val="center"/>
@@ -12540,9 +12520,9 @@
           </m:r>
         </m:oMath>
       </m:oMathPara>
-      <w:bookmarkEnd w:id="55"/>
+      <w:bookmarkEnd w:id="54"/>
     </w:p>
-    <w:bookmarkEnd w:id="56"/>
+    <w:bookmarkEnd w:id="55"/>
     <w:p>
       <w:pPr>
         <w:pStyle w:val="FirstParagraph"/>
@@ -12710,7 +12690,7 @@
       <w:r>
         <w:t xml:space="preserve"> </w:t>
       </w:r>
-      <w:hyperlink r:id="rId57">
+      <w:hyperlink r:id="rId56">
         <w:r>
           <w:rPr>
             <w:rStyle w:val="Hyperlink"/>
@@ -12755,7 +12735,7 @@
         <w:t xml:space="preserve">give.</w:t>
       </w:r>
     </w:p>
-    <w:bookmarkStart w:id="59" w:name="cor-logistic-wald"/>
+    <w:bookmarkStart w:id="58" w:name="cor-logistic-wald"/>
     <w:p>
       <w:pPr>
         <w:pStyle w:val="BodyText"/>
@@ -13032,7 +13012,7 @@
       <w:r>
         <w:t xml:space="preserve"> </w:t>
       </w:r>
-      <w:hyperlink r:id="rId58">
+      <w:hyperlink r:id="rId57">
         <w:r>
           <w:rPr>
             <w:rStyle w:val="Hyperlink"/>
@@ -13210,8 +13190,8 @@
         </m:oMath>
       </m:oMathPara>
     </w:p>
-    <w:bookmarkEnd w:id="59"/>
-    <w:bookmarkStart w:id="60" w:name="exm-logistic-wald"/>
+    <w:bookmarkEnd w:id="58"/>
+    <w:bookmarkStart w:id="59" w:name="exm-logistic-wald"/>
     <w:p>
       <w:pPr>
         <w:pStyle w:val="FirstParagraph"/>
@@ -13863,8 +13843,8 @@
         <w:t xml:space="preserve">.</w:t>
       </w:r>
     </w:p>
-    <w:bookmarkEnd w:id="60"/>
-    <w:bookmarkStart w:id="61" w:name="cor-logistic-odds-interval"/>
+    <w:bookmarkEnd w:id="59"/>
+    <w:bookmarkStart w:id="60" w:name="cor-logistic-odds-interval"/>
     <w:p>
       <w:pPr>
         <w:pStyle w:val="BodyText"/>
@@ -14085,7 +14065,7 @@
         <w:t xml:space="preserve">.</w:t>
       </w:r>
     </w:p>
-    <w:bookmarkEnd w:id="61"/>
+    <w:bookmarkEnd w:id="60"/>
     <w:p>
       <w:pPr>
         <w:pStyle w:val="BodyText"/>
@@ -14210,7 +14190,7 @@
         <w:t xml:space="preserve">.</w:t>
       </w:r>
     </w:p>
-    <w:bookmarkStart w:id="62" w:name="exm-logistic-odds-interval"/>
+    <w:bookmarkStart w:id="61" w:name="exm-logistic-odds-interval"/>
     <w:p>
       <w:pPr>
         <w:pStyle w:val="BodyText"/>
@@ -14582,9 +14562,9 @@
         <w:t xml:space="preserve">Its width shows how little information six observations carry about the slope.</w:t>
       </w:r>
     </w:p>
+    <w:bookmarkEnd w:id="61"/>
     <w:bookmarkEnd w:id="62"/>
-    <w:bookmarkEnd w:id="63"/>
-    <w:bookmarkStart w:id="74" w:name="references"/>
+    <w:bookmarkStart w:id="73" w:name="references"/>
     <w:p>
       <w:pPr>
         <w:pStyle w:val="Heading2"/>
@@ -14593,8 +14573,8 @@
         <w:t xml:space="preserve">References</w:t>
       </w:r>
     </w:p>
-    <w:bookmarkStart w:id="73" w:name="refs"/>
-    <w:bookmarkStart w:id="65" w:name="ref-dobson4e"/>
+    <w:bookmarkStart w:id="72" w:name="refs"/>
+    <w:bookmarkStart w:id="64" w:name="ref-dobson4e"/>
     <w:p>
       <w:pPr>
         <w:pStyle w:val="Bibliography"/>
@@ -14618,7 +14598,7 @@
       <w:r>
         <w:t xml:space="preserve"> </w:t>
       </w:r>
-      <w:hyperlink r:id="rId64">
+      <w:hyperlink r:id="rId63">
         <w:r>
           <w:rPr>
             <w:rStyle w:val="Hyperlink"/>
@@ -14630,8 +14610,8 @@
         <w:t xml:space="preserve">.</w:t>
       </w:r>
     </w:p>
-    <w:bookmarkEnd w:id="65"/>
-    <w:bookmarkStart w:id="67" w:name="ref-fahrmeir1985consistency"/>
+    <w:bookmarkEnd w:id="64"/>
+    <w:bookmarkStart w:id="66" w:name="ref-fahrmeir1985consistency"/>
     <w:p>
       <w:pPr>
         <w:pStyle w:val="Bibliography"/>
@@ -14664,7 +14644,7 @@
       <w:r>
         <w:t xml:space="preserve"> </w:t>
       </w:r>
-      <w:hyperlink r:id="rId66">
+      <w:hyperlink r:id="rId65">
         <w:r>
           <w:rPr>
             <w:rStyle w:val="Hyperlink"/>
@@ -14676,8 +14656,8 @@
         <w:t xml:space="preserve">.</w:t>
       </w:r>
     </w:p>
-    <w:bookmarkEnd w:id="67"/>
-    <w:bookmarkStart w:id="69" w:name="ref-hastie2009elements"/>
+    <w:bookmarkEnd w:id="66"/>
+    <w:bookmarkStart w:id="68" w:name="ref-hastie2009elements"/>
     <w:p>
       <w:pPr>
         <w:pStyle w:val="Bibliography"/>
@@ -14701,7 +14681,7 @@
       <w:r>
         <w:t xml:space="preserve"> </w:t>
       </w:r>
-      <w:hyperlink r:id="rId68">
+      <w:hyperlink r:id="rId67">
         <w:r>
           <w:rPr>
             <w:rStyle w:val="Hyperlink"/>
@@ -14713,8 +14693,8 @@
         <w:t xml:space="preserve">.</w:t>
       </w:r>
     </w:p>
-    <w:bookmarkEnd w:id="69"/>
-    <w:bookmarkStart w:id="70" w:name="ref-hosmer1989applied"/>
+    <w:bookmarkEnd w:id="68"/>
+    <w:bookmarkStart w:id="69" w:name="ref-hosmer1989applied"/>
     <w:p>
       <w:pPr>
         <w:pStyle w:val="Bibliography"/>
@@ -14736,8 +14716,8 @@
         <w:t xml:space="preserve">. Wiley.</w:t>
       </w:r>
     </w:p>
-    <w:bookmarkEnd w:id="70"/>
-    <w:bookmarkStart w:id="72" w:name="ref-nelder1972generalized"/>
+    <w:bookmarkEnd w:id="69"/>
+    <w:bookmarkStart w:id="71" w:name="ref-nelder1972generalized"/>
     <w:p>
       <w:pPr>
         <w:pStyle w:val="Bibliography"/>
@@ -14770,7 +14750,7 @@
       <w:r>
         <w:t xml:space="preserve"> </w:t>
       </w:r>
-      <w:hyperlink r:id="rId71">
+      <w:hyperlink r:id="rId70">
         <w:r>
           <w:rPr>
             <w:rStyle w:val="Hyperlink"/>
@@ -14782,9 +14762,9 @@
         <w:t xml:space="preserve">.</w:t>
       </w:r>
     </w:p>
+    <w:bookmarkEnd w:id="71"/>
     <w:bookmarkEnd w:id="72"/>
     <w:bookmarkEnd w:id="73"/>
-    <w:bookmarkEnd w:id="74"/>
     <w:sectPr>
       <w:footnotePr>
         <w:numRestart w:val="eachSect"/>

</xml_diff>

<commit_message>
Deploying to gh-pages from @ Morrison-Lab/sds@2d8df42b12d4faa2fbdcd01021c8f081670b55f9 🚀
</commit_message>
<xml_diff>
--- a/logistic-inference-handout.docx
+++ b/logistic-inference-handout.docx
@@ -15,7 +15,7 @@
         <w:pStyle w:val="Date"/>
       </w:pPr>
       <w:r>
-        <w:t xml:space="preserve">Last modified: 2026-10-24 18:13:43 (PDT)</w:t>
+        <w:t xml:space="preserve">Last modified: 2026-10-24 20:18:33 (PDT)</w:t>
       </w:r>
     </w:p>
     <w:bookmarkStart w:id="14" w:name="introduction"/>
@@ -244,9 +244,9 @@
       <w:r>
         <w:t xml:space="preserve">$$
     {\Pr\mathopen{}\left(Y_i= 1 \mid \mathord{\smash[b]{\underset{\raise.3ex\hbox{$\scriptstyle\sim$}}{x}}\vphantom{x}}_i\right)\mathclose{}} = \pi_i
-    = {\sigma\mathopen{}\left(\mathord{\smash[b]{\underset{\raise.3ex\hbox{$\scriptstyle\sim$}}{\beta}}\vphantom{\beta}} \cdot \mathord{\smash[b]{\underset{\raise.3ex\hbox{$\scriptstyle\sim$}}{x}}\vphantom{x}}_i\right)\mathclose{}},
+    = {\operatorname{expit}\mathopen{}\left(\mathord{\smash[b]{\underset{\raise.3ex\hbox{$\scriptstyle\sim$}}{\beta}}\vphantom{\beta}} \cdot \mathord{\smash[b]{\underset{\raise.3ex\hbox{$\scriptstyle\sim$}}{x}}\vphantom{x}}_i\right)\mathclose{}},
     \qquad
-    {\sigma\mathopen{}\left(u\right)\mathclose{}} = \frac{1}{1 + e^{-u}},
+    {\operatorname{expit}\mathopen{}\left(u\right)\mathclose{}} = \frac{1}{1 + e^{-u}},
      \qquad(1)$$</w:t>
       </w:r>
       <w:bookmarkEnd w:id="11"/>
@@ -1106,7 +1106,7 @@
         <w:t xml:space="preserve"> </w:t>
       </w:r>
       <w:r>
-        <w:t xml:space="preserve">$\hat\pi_i = {\sigma\mathopen{}\left(\hat{\mathord{\smash[b]{\underset{\raise.3ex\hbox{$\scriptstyle\sim$}}{\beta}}\vphantom{\beta}}} \cdot \mathord{\smash[b]{\underset{\raise.3ex\hbox{$\scriptstyle\sim$}}{x}}\vphantom{x}}_i\right)\mathclose{}}$</w:t>
+        <w:t xml:space="preserve">$\hat\pi_i = {\operatorname{expit}\mathopen{}\left(\hat{\mathord{\smash[b]{\underset{\raise.3ex\hbox{$\scriptstyle\sim$}}{\beta}}\vphantom{\beta}}} \cdot \mathord{\smash[b]{\underset{\raise.3ex\hbox{$\scriptstyle\sim$}}{x}}\vphantom{x}}_i\right)\mathclose{}}$</w:t>
       </w:r>
       <w:r>
         <w:t xml:space="preserve"> </w:t>

</xml_diff>

<commit_message>
Deploying to gh-pages from @ Morrison-Lab/sds@dc13559023b2cacfb7cadb476b7ef14d60219a9b 🚀
</commit_message>
<xml_diff>
--- a/logistic-inference-handout.docx
+++ b/logistic-inference-handout.docx
@@ -15,7 +15,7 @@
         <w:pStyle w:val="Date"/>
       </w:pPr>
       <w:r>
-        <w:t xml:space="preserve">Last modified: 2026-10-30 00:29:08 (PDT)</w:t>
+        <w:t xml:space="preserve">Last modified: 2026-10-30 07:36:33 (PDT)</w:t>
       </w:r>
     </w:p>
     <w:bookmarkStart w:id="14" w:name="introduction"/>
@@ -14754,7 +14754,24 @@
         <w:t xml:space="preserve"> </w:t>
       </w:r>
       <w:r>
-        <w:t xml:space="preserve">and its Hessian is</w:t>
+        <w:t xml:space="preserve">and its</w:t>
+      </w:r>
+      <w:r>
+        <w:t xml:space="preserve"> </w:t>
+      </w:r>
+      <w:hyperlink r:id="rId32">
+        <w:r>
+          <w:rPr>
+            <w:rStyle w:val="Hyperlink"/>
+          </w:rPr>
+          <w:t xml:space="preserve">Hessian</w:t>
+        </w:r>
+      </w:hyperlink>
+      <w:r>
+        <w:t xml:space="preserve"> </w:t>
+      </w:r>
+      <w:r>
+        <w:t xml:space="preserve">is</w:t>
       </w:r>
       <w:r>
         <w:t xml:space="preserve"> </w:t>
@@ -14789,13 +14806,53 @@
         </m:r>
       </m:oMath>
       <w:r>
-        <w:t xml:space="preserve">, which does not involve the outcomes.</w:t>
-      </w:r>
-      <w:r>
-        <w:t xml:space="preserve"> </w:t>
-      </w:r>
-      <w:r>
-        <w:t xml:space="preserve">The observed and expected information are therefore both</w:t>
+        <w:t xml:space="preserve">,</w:t>
+      </w:r>
+      <w:r>
+        <w:t xml:space="preserve"> </w:t>
+      </w:r>
+      <w:r>
+        <w:t xml:space="preserve">which does not involve the outcomes.</w:t>
+      </w:r>
+      <w:r>
+        <w:t xml:space="preserve"> </w:t>
+      </w:r>
+      <w:r>
+        <w:t xml:space="preserve">The</w:t>
+      </w:r>
+      <w:r>
+        <w:t xml:space="preserve"> </w:t>
+      </w:r>
+      <w:hyperlink r:id="rId33">
+        <w:r>
+          <w:rPr>
+            <w:rStyle w:val="Hyperlink"/>
+          </w:rPr>
+          <w:t xml:space="preserve">observed information</w:t>
+        </w:r>
+      </w:hyperlink>
+      <w:r>
+        <w:t xml:space="preserve"> </w:t>
+      </w:r>
+      <w:r>
+        <w:t xml:space="preserve">and</w:t>
+      </w:r>
+      <w:r>
+        <w:t xml:space="preserve"> </w:t>
+      </w:r>
+      <w:hyperlink r:id="rId34">
+        <w:r>
+          <w:rPr>
+            <w:rStyle w:val="Hyperlink"/>
+          </w:rPr>
+          <w:t xml:space="preserve">expected information</w:t>
+        </w:r>
+      </w:hyperlink>
+      <w:r>
+        <w:t xml:space="preserve"> </w:t>
+      </w:r>
+      <w:r>
+        <w:t xml:space="preserve">are therefore both</w:t>
       </w:r>
       <w:r>
         <w:t xml:space="preserve"> </w:t>

</xml_diff>